<commit_message>
add new merge file
</commit_message>
<xml_diff>
--- a/บทที่ 3.docx
+++ b/บทที่ 3.docx
@@ -10542,11 +10542,20 @@
       </w:r>
       <w:r>
         <w:rPr>
-          <w:rFonts w:ascii="TH SarabunPSK" w:hAnsi="TH SarabunPSK" w:cs="TH SarabunPSK"/>
-          <w:sz w:val="32"/>
-          <w:szCs w:val="32"/>
-        </w:rPr>
-        <w:t xml:space="preserve">3 </w:t>
+          <w:rFonts w:ascii="TH SarabunPSK" w:hAnsi="TH SarabunPSK" w:cs="TH SarabunPSK" w:hint="cs"/>
+          <w:sz w:val="32"/>
+          <w:szCs w:val="32"/>
+          <w:cs/>
+        </w:rPr>
+        <w:t>2</w:t>
+      </w:r>
+      <w:r>
+        <w:rPr>
+          <w:rFonts w:ascii="TH SarabunPSK" w:hAnsi="TH SarabunPSK" w:cs="TH SarabunPSK"/>
+          <w:sz w:val="32"/>
+          <w:szCs w:val="32"/>
+        </w:rPr>
+        <w:t xml:space="preserve"> </w:t>
       </w:r>
       <w:r>
         <w:rPr>
@@ -11194,11 +11203,20 @@
       </w:r>
       <w:r>
         <w:rPr>
-          <w:rFonts w:ascii="TH SarabunPSK" w:hAnsi="TH SarabunPSK" w:cs="TH SarabunPSK"/>
-          <w:sz w:val="32"/>
-          <w:szCs w:val="32"/>
-        </w:rPr>
-        <w:t xml:space="preserve">4 </w:t>
+          <w:rFonts w:ascii="TH SarabunPSK" w:hAnsi="TH SarabunPSK" w:cs="TH SarabunPSK" w:hint="cs"/>
+          <w:sz w:val="32"/>
+          <w:szCs w:val="32"/>
+          <w:cs/>
+        </w:rPr>
+        <w:t>2</w:t>
+      </w:r>
+      <w:r>
+        <w:rPr>
+          <w:rFonts w:ascii="TH SarabunPSK" w:hAnsi="TH SarabunPSK" w:cs="TH SarabunPSK"/>
+          <w:sz w:val="32"/>
+          <w:szCs w:val="32"/>
+        </w:rPr>
+        <w:t xml:space="preserve"> </w:t>
       </w:r>
       <w:r>
         <w:rPr>
@@ -12123,11 +12141,20 @@
       </w:r>
       <w:r>
         <w:rPr>
-          <w:rFonts w:ascii="TH SarabunPSK" w:hAnsi="TH SarabunPSK" w:cs="TH SarabunPSK"/>
-          <w:sz w:val="32"/>
-          <w:szCs w:val="32"/>
-        </w:rPr>
-        <w:t xml:space="preserve">5 </w:t>
+          <w:rFonts w:ascii="TH SarabunPSK" w:hAnsi="TH SarabunPSK" w:cs="TH SarabunPSK" w:hint="cs"/>
+          <w:sz w:val="32"/>
+          <w:szCs w:val="32"/>
+          <w:cs/>
+        </w:rPr>
+        <w:t>2</w:t>
+      </w:r>
+      <w:r>
+        <w:rPr>
+          <w:rFonts w:ascii="TH SarabunPSK" w:hAnsi="TH SarabunPSK" w:cs="TH SarabunPSK"/>
+          <w:sz w:val="32"/>
+          <w:szCs w:val="32"/>
+        </w:rPr>
+        <w:t xml:space="preserve"> </w:t>
       </w:r>
       <w:r>
         <w:rPr>
@@ -12907,11 +12934,20 @@
       </w:r>
       <w:r>
         <w:rPr>
-          <w:rFonts w:ascii="TH SarabunPSK" w:hAnsi="TH SarabunPSK" w:cs="TH SarabunPSK"/>
-          <w:sz w:val="32"/>
-          <w:szCs w:val="32"/>
-        </w:rPr>
-        <w:t xml:space="preserve">6 </w:t>
+          <w:rFonts w:ascii="TH SarabunPSK" w:hAnsi="TH SarabunPSK" w:cs="TH SarabunPSK" w:hint="cs"/>
+          <w:sz w:val="32"/>
+          <w:szCs w:val="32"/>
+          <w:cs/>
+        </w:rPr>
+        <w:t>2</w:t>
+      </w:r>
+      <w:r>
+        <w:rPr>
+          <w:rFonts w:ascii="TH SarabunPSK" w:hAnsi="TH SarabunPSK" w:cs="TH SarabunPSK"/>
+          <w:sz w:val="32"/>
+          <w:szCs w:val="32"/>
+        </w:rPr>
+        <w:t xml:space="preserve"> </w:t>
       </w:r>
       <w:r>
         <w:rPr>
@@ -13499,11 +13535,20 @@
       </w:r>
       <w:r>
         <w:rPr>
-          <w:rFonts w:ascii="TH SarabunPSK" w:hAnsi="TH SarabunPSK" w:cs="TH SarabunPSK"/>
-          <w:sz w:val="32"/>
-          <w:szCs w:val="32"/>
-        </w:rPr>
-        <w:t xml:space="preserve">6 </w:t>
+          <w:rFonts w:ascii="TH SarabunPSK" w:hAnsi="TH SarabunPSK" w:cs="TH SarabunPSK" w:hint="cs"/>
+          <w:sz w:val="32"/>
+          <w:szCs w:val="32"/>
+          <w:cs/>
+        </w:rPr>
+        <w:t>2</w:t>
+      </w:r>
+      <w:r>
+        <w:rPr>
+          <w:rFonts w:ascii="TH SarabunPSK" w:hAnsi="TH SarabunPSK" w:cs="TH SarabunPSK"/>
+          <w:sz w:val="32"/>
+          <w:szCs w:val="32"/>
+        </w:rPr>
+        <w:t xml:space="preserve"> </w:t>
       </w:r>
       <w:r>
         <w:rPr>
@@ -14023,11 +14068,20 @@
       </w:r>
       <w:r>
         <w:rPr>
-          <w:rFonts w:ascii="TH SarabunPSK" w:hAnsi="TH SarabunPSK" w:cs="TH SarabunPSK"/>
-          <w:sz w:val="32"/>
-          <w:szCs w:val="32"/>
-        </w:rPr>
-        <w:t xml:space="preserve">7 </w:t>
+          <w:rFonts w:ascii="TH SarabunPSK" w:hAnsi="TH SarabunPSK" w:cs="TH SarabunPSK" w:hint="cs"/>
+          <w:sz w:val="32"/>
+          <w:szCs w:val="32"/>
+          <w:cs/>
+        </w:rPr>
+        <w:t>2</w:t>
+      </w:r>
+      <w:r>
+        <w:rPr>
+          <w:rFonts w:ascii="TH SarabunPSK" w:hAnsi="TH SarabunPSK" w:cs="TH SarabunPSK"/>
+          <w:sz w:val="32"/>
+          <w:szCs w:val="32"/>
+        </w:rPr>
+        <w:t xml:space="preserve"> </w:t>
       </w:r>
       <w:r>
         <w:rPr>
@@ -14646,11 +14700,12 @@
       </w:r>
       <w:r>
         <w:rPr>
-          <w:rFonts w:ascii="TH SarabunPSK" w:hAnsi="TH SarabunPSK" w:cs="TH SarabunPSK"/>
-          <w:sz w:val="32"/>
-          <w:szCs w:val="32"/>
-        </w:rPr>
-        <w:t>8</w:t>
+          <w:rFonts w:ascii="TH SarabunPSK" w:hAnsi="TH SarabunPSK" w:cs="TH SarabunPSK" w:hint="cs"/>
+          <w:sz w:val="32"/>
+          <w:szCs w:val="32"/>
+          <w:cs/>
+        </w:rPr>
+        <w:t>2</w:t>
       </w:r>
       <w:r>
         <w:rPr>

</xml_diff>